<commit_message>
Referent Markus Warscher eintragen
Namen auf Folien (1, 2, 39), Trainerhandbuch-Deckblatt und Infoblatt (Web/PDF)
eingesetzt. Persönliche Story-Passagen bleiben Platzhalter.

Co-Authored-By: Claude Opus 4.8 <noreply@anthropic.com>
Claude-Session: https://claude.ai/code/session_01GYepHDnc6PQdCAJVNphDNw
</commit_message>
<xml_diff>
--- a/workshop-psychische-gesundheit/Trainerhandbuch_Seminarunterlage.docx
+++ b/workshop-psychische-gesundheit/Trainerhandbuch_Seminarunterlage.docx
@@ -145,7 +145,18 @@
           <w:sz w:val="22"/>
           <w:szCs w:val="22"/>
         </w:rPr>
-        <w:t xml:space="preserve">Referent: ______________________________________</w:t>
+        <w:t xml:space="preserve">Referent: </w:t>
+      </w:r>
+      <w:r>
+        <w:rPr>
+          <w:rFonts w:ascii="Calibri" w:cs="Calibri" w:eastAsia="Calibri" w:hAnsi="Calibri"/>
+          <w:b/>
+          <w:bCs/>
+          <w:color w:val="2E4A52"/>
+          <w:sz w:val="22"/>
+          <w:szCs w:val="22"/>
+        </w:rPr>
+        <w:t xml:space="preserve">Markus Warscher</w:t>
       </w:r>
     </w:p>
     <w:p>

</xml_diff>